<commit_message>
added add recipe page and show recipe page
</commit_message>
<xml_diff>
--- a/public_html/images/images-documentation.docx
+++ b/public_html/images/images-documentation.docx
@@ -137,6 +137,24 @@
       </w:pPr>
       <w:r>
         <w:t>steak-and-veggies.png</w:t>
+      </w:r>
+    </w:p>
+    <w:p>
+      <w:pPr>
+        <w:pStyle w:val="ListParagraph"/>
+        <w:numPr>
+          <w:ilvl w:val="0"/>
+          <w:numId w:val="1"/>
+        </w:numPr>
+      </w:pPr>
+      <w:r>
+        <w:t>logos.png (cropped to make favicon.ico, logo.png, small-logo.png</w:t>
+      </w:r>
+      <w:r>
+        <w:t>, big-logo.png, big-small-logo.png, ico48.png, ico32.png, ico16.png</w:t>
+      </w:r>
+      <w:r>
+        <w:t>)</w:t>
       </w:r>
     </w:p>
     <w:p/>

</xml_diff>

<commit_message>
Added a lot of functionality: responsive header, footer, home page with new recipes, top rated recipes, and 30 minute recipes sections, and improved image handling
</commit_message>
<xml_diff>
--- a/public_html/images/images-documentation.docx
+++ b/public_html/images/images-documentation.docx
@@ -155,6 +155,33 @@
       </w:r>
       <w:r>
         <w:t>)</w:t>
+      </w:r>
+    </w:p>
+    <w:p>
+      <w:pPr>
+        <w:pStyle w:val="ListParagraph"/>
+        <w:numPr>
+          <w:ilvl w:val="0"/>
+          <w:numId w:val="1"/>
+        </w:numPr>
+      </w:pPr>
+      <w:r>
+        <w:t>recipe-placeholder</w:t>
+      </w:r>
+      <w:r>
+        <w:t>.png</w:t>
+      </w:r>
+    </w:p>
+    <w:p>
+      <w:pPr>
+        <w:pStyle w:val="ListParagraph"/>
+        <w:numPr>
+          <w:ilvl w:val="0"/>
+          <w:numId w:val="1"/>
+        </w:numPr>
+      </w:pPr>
+      <w:r>
+        <w:t>hero-food-bg.png</w:t>
       </w:r>
     </w:p>
     <w:p/>
@@ -185,9 +212,11 @@
           <w:numId w:val="2"/>
         </w:numPr>
       </w:pPr>
+      <w:proofErr w:type="spellStart"/>
       <w:r>
         <w:t>clock.svg</w:t>
       </w:r>
+      <w:proofErr w:type="spellEnd"/>
     </w:p>
     <w:p>
       <w:pPr>
@@ -197,9 +226,11 @@
           <w:numId w:val="2"/>
         </w:numPr>
       </w:pPr>
+      <w:proofErr w:type="spellStart"/>
       <w:r>
         <w:t>search.svg</w:t>
       </w:r>
+      <w:proofErr w:type="spellEnd"/>
     </w:p>
     <w:p>
       <w:pPr>

</xml_diff>